<commit_message>
Update study notes and summaries for all languages for 2026-06-12 release
</commit_message>
<xml_diff>
--- a/eng/docx/01.content.docx
+++ b/eng/docx/01.content.docx
@@ -218,20 +218,6 @@
         <w:rPr>
           <w:lang w:val="en_US" w:bidi="en_US"/>
         </w:rPr>
-      </w:r>
-    </w:p>
-    <w:p>
-      <w:pPr/>
-      <w:r>
-        <w:rPr>
-          <w:lang w:val="en_US" w:bidi="en_US"/>
-        </w:rPr>
-      </w:r>
-      <w:r>
-        <w:rPr>
-          <w:lang w:val="en_US" w:bidi="en_US"/>
-        </w:rPr>
-        <w:t>The Book of Genesis</w:t>
       </w:r>
     </w:p>
     <w:p>

</xml_diff>